<commit_message>
Add Phase 2 Week 1 Day 1 assignment details to Assignment.docx
</commit_message>
<xml_diff>
--- a/TASKS/Phase 2/week 1_day 1/Assignment.docx
+++ b/TASKS/Phase 2/week 1_day 1/Assignment.docx
@@ -89,6 +89,116 @@
     </w:p>
     <w:p/>
     <w:p/>
+    <w:p/>
+    <w:p>
+      <w:pPr>
+        <w:pStyle w:val="Heading1"/>
+      </w:pPr>
+      <w:r>
+        <w:t>Phase 2 – Week 1, Day 1: Building an AI Flow in Langflow</w:t>
+      </w:r>
+    </w:p>
+    <w:p>
+      <w:r>
+        <w:t>This assignment demonstrates building a simple AI-powered document processing pipeline using Langflow (a visual, no-code/low-code tool for chaining AI components).</w:t>
+      </w:r>
+    </w:p>
+    <w:p>
+      <w:pPr>
+        <w:pStyle w:val="Heading2"/>
+      </w:pPr>
+      <w:r>
+        <w:t>What the Flow Does</w:t>
+      </w:r>
+    </w:p>
+    <w:p>
+      <w:r>
+        <w:t>The pipeline reads a PDF file, sends its content to an LLM (via Groq), and outputs the result. Here's how each component works:</w:t>
+      </w:r>
+    </w:p>
+    <w:p>
+      <w:pPr>
+        <w:pStyle w:val="Heading3"/>
+      </w:pPr>
+      <w:r>
+        <w:t>Image 1 — The Flow Canvas:</w:t>
+      </w:r>
+    </w:p>
+    <w:p>
+      <w:r>
+        <w:t>The flow has three connected nodes:</w:t>
+      </w:r>
+    </w:p>
+    <w:p>
+      <w:r>
+        <w:t xml:space="preserve">1. </w:t>
+      </w:r>
+      <w:r>
+        <w:rPr>
+          <w:b/>
+        </w:rPr>
+        <w:t>Read File</w:t>
+      </w:r>
+      <w:r>
+        <w:t xml:space="preserve"> — Loads a PDF (sample_invoice (1).pdf, 3.65 KB) and extracts its raw text content. The "Advanced Parser" option is toggled off, meaning it uses basic text extraction.</w:t>
+      </w:r>
+    </w:p>
+    <w:p>
+      <w:r>
+        <w:t xml:space="preserve">2. </w:t>
+      </w:r>
+      <w:r>
+        <w:rPr>
+          <w:b/>
+        </w:rPr>
+        <w:t>Prompt Template</w:t>
+      </w:r>
+      <w:r>
+        <w:t xml:space="preserve"> — Takes the raw file content and injects it into a prompt. The visible text suggests a prompt like "Read the entire PDF get strictly Copywriting – Homepage and..." — likely asking the LLM to extract or summarize specific information from the invoice.</w:t>
+      </w:r>
+    </w:p>
+    <w:p>
+      <w:r>
+        <w:t xml:space="preserve">3. </w:t>
+      </w:r>
+      <w:r>
+        <w:rPr>
+          <w:b/>
+        </w:rPr>
+        <w:t>Groq (LLM)</w:t>
+      </w:r>
+      <w:r>
+        <w:t xml:space="preserve"> — Sends the assembled prompt to the Llama-3.3-70b-versatile model via Groq's API. Key settings visible on the right panel:</w:t>
+      </w:r>
+    </w:p>
+    <w:p>
+      <w:r>
+        <w:t xml:space="preserve">    • Temperature: ~0.19 (low = more factual/deterministic output)</w:t>
+      </w:r>
+    </w:p>
+    <w:p>
+      <w:r>
+        <w:t xml:space="preserve">    • Groq API Key is connected</w:t>
+      </w:r>
+    </w:p>
+    <w:p>
+      <w:r>
+        <w:t xml:space="preserve">    • Output feeds into a Chat Output node</w:t>
+      </w:r>
+    </w:p>
+    <w:p>
+      <w:pPr>
+        <w:pStyle w:val="Heading3"/>
+      </w:pPr>
+      <w:r>
+        <w:t>Image 2 — The Result:</w:t>
+      </w:r>
+    </w:p>
+    <w:p>
+      <w:r>
+        <w:t>After running the flow, the Component Output panel shows the result: $600.00 — meaning the AI successfully read the invoice PDF and extracted the total amount ($600) from it.</w:t>
+      </w:r>
+    </w:p>
     <w:sectPr>
       <w:pgSz w:w="11906" w:h="16838"/>
       <w:pgMar w:top="1440" w:right="1440" w:bottom="1440" w:left="1440" w:header="708" w:footer="708" w:gutter="0"/>

</xml_diff>

<commit_message>
Update Assignment.docx with latest changes
</commit_message>
<xml_diff>
--- a/TASKS/Phase 2/week 1_day 1/Assignment.docx
+++ b/TASKS/Phase 2/week 1_day 1/Assignment.docx
@@ -26,7 +26,7 @@
                     <pic:cNvPicPr/>
                   </pic:nvPicPr>
                   <pic:blipFill>
-                    <a:blip r:embed="rId4"/>
+                    <a:blip r:embed="rId5"/>
                     <a:stretch>
                       <a:fillRect/>
                     </a:stretch>
@@ -66,7 +66,7 @@
                     <pic:cNvPicPr/>
                   </pic:nvPicPr>
                   <pic:blipFill>
-                    <a:blip r:embed="rId5"/>
+                    <a:blip r:embed="rId6"/>
                     <a:stretch>
                       <a:fillRect/>
                     </a:stretch>
@@ -88,117 +88,625 @@
       </w:r>
     </w:p>
     <w:p/>
+    <w:p>
+      <w:pPr>
+        <w:spacing w:before="100" w:beforeAutospacing="1" w:after="100" w:afterAutospacing="1" w:line="240" w:lineRule="auto"/>
+        <w:outlineLvl w:val="1"/>
+        <w:rPr>
+          <w:rFonts w:ascii="Times New Roman" w:eastAsia="Times New Roman" w:hAnsi="Times New Roman" w:cs="Times New Roman"/>
+          <w:b/>
+          <w:bCs/>
+          <w:kern w:val="0"/>
+          <w:sz w:val="36"/>
+          <w:szCs w:val="36"/>
+          <w:lang w:eastAsia="en-IN"/>
+          <w14:ligatures w14:val="none"/>
+        </w:rPr>
+      </w:pPr>
+      <w:r>
+        <w:rPr>
+          <w:rFonts w:ascii="Times New Roman" w:eastAsia="Times New Roman" w:hAnsi="Times New Roman" w:cs="Times New Roman"/>
+          <w:b/>
+          <w:bCs/>
+          <w:kern w:val="0"/>
+          <w:sz w:val="36"/>
+          <w:szCs w:val="36"/>
+          <w:lang w:eastAsia="en-IN"/>
+          <w14:ligatures w14:val="none"/>
+        </w:rPr>
+        <w:t xml:space="preserve">Phase 2 – Week 1, Day 1: Building an AI Flow in </w:t>
+      </w:r>
+      <w:proofErr w:type="spellStart"/>
+      <w:r>
+        <w:rPr>
+          <w:rFonts w:ascii="Times New Roman" w:eastAsia="Times New Roman" w:hAnsi="Times New Roman" w:cs="Times New Roman"/>
+          <w:b/>
+          <w:bCs/>
+          <w:kern w:val="0"/>
+          <w:sz w:val="36"/>
+          <w:szCs w:val="36"/>
+          <w:lang w:eastAsia="en-IN"/>
+          <w14:ligatures w14:val="none"/>
+        </w:rPr>
+        <w:t>Langflow</w:t>
+      </w:r>
+      <w:proofErr w:type="spellEnd"/>
+    </w:p>
+    <w:p>
+      <w:pPr>
+        <w:spacing w:before="100" w:beforeAutospacing="1" w:after="100" w:afterAutospacing="1" w:line="240" w:lineRule="auto"/>
+        <w:rPr>
+          <w:rFonts w:ascii="Times New Roman" w:eastAsia="Times New Roman" w:hAnsi="Times New Roman" w:cs="Times New Roman"/>
+          <w:kern w:val="0"/>
+          <w:lang w:eastAsia="en-IN"/>
+          <w14:ligatures w14:val="none"/>
+        </w:rPr>
+      </w:pPr>
+      <w:r>
+        <w:rPr>
+          <w:rFonts w:ascii="Times New Roman" w:eastAsia="Times New Roman" w:hAnsi="Times New Roman" w:cs="Times New Roman"/>
+          <w:kern w:val="0"/>
+          <w:lang w:eastAsia="en-IN"/>
+          <w14:ligatures w14:val="none"/>
+        </w:rPr>
+        <w:lastRenderedPageBreak/>
+        <w:t xml:space="preserve">This assignment demonstrates building a simple </w:t>
+      </w:r>
+      <w:r>
+        <w:rPr>
+          <w:rFonts w:ascii="Times New Roman" w:eastAsia="Times New Roman" w:hAnsi="Times New Roman" w:cs="Times New Roman"/>
+          <w:b/>
+          <w:bCs/>
+          <w:kern w:val="0"/>
+          <w:lang w:eastAsia="en-IN"/>
+          <w14:ligatures w14:val="none"/>
+        </w:rPr>
+        <w:t>AI-powered document processing pipeline</w:t>
+      </w:r>
+      <w:r>
+        <w:rPr>
+          <w:rFonts w:ascii="Times New Roman" w:eastAsia="Times New Roman" w:hAnsi="Times New Roman" w:cs="Times New Roman"/>
+          <w:kern w:val="0"/>
+          <w:lang w:eastAsia="en-IN"/>
+          <w14:ligatures w14:val="none"/>
+        </w:rPr>
+        <w:t xml:space="preserve"> using </w:t>
+      </w:r>
+      <w:proofErr w:type="spellStart"/>
+      <w:r>
+        <w:rPr>
+          <w:rFonts w:ascii="Times New Roman" w:eastAsia="Times New Roman" w:hAnsi="Times New Roman" w:cs="Times New Roman"/>
+          <w:b/>
+          <w:bCs/>
+          <w:kern w:val="0"/>
+          <w:lang w:eastAsia="en-IN"/>
+          <w14:ligatures w14:val="none"/>
+        </w:rPr>
+        <w:t>Langflow</w:t>
+      </w:r>
+      <w:proofErr w:type="spellEnd"/>
+      <w:r>
+        <w:rPr>
+          <w:rFonts w:ascii="Times New Roman" w:eastAsia="Times New Roman" w:hAnsi="Times New Roman" w:cs="Times New Roman"/>
+          <w:kern w:val="0"/>
+          <w:lang w:eastAsia="en-IN"/>
+          <w14:ligatures w14:val="none"/>
+        </w:rPr>
+        <w:t xml:space="preserve"> (a visual, no-code/low-code tool for chaining AI components).</w:t>
+      </w:r>
+    </w:p>
+    <w:p>
+      <w:pPr>
+        <w:spacing w:before="100" w:beforeAutospacing="1" w:after="100" w:afterAutospacing="1" w:line="240" w:lineRule="auto"/>
+        <w:outlineLvl w:val="2"/>
+        <w:rPr>
+          <w:rFonts w:ascii="Times New Roman" w:eastAsia="Times New Roman" w:hAnsi="Times New Roman" w:cs="Times New Roman"/>
+          <w:b/>
+          <w:bCs/>
+          <w:kern w:val="0"/>
+          <w:sz w:val="27"/>
+          <w:szCs w:val="27"/>
+          <w:lang w:eastAsia="en-IN"/>
+          <w14:ligatures w14:val="none"/>
+        </w:rPr>
+      </w:pPr>
+      <w:r>
+        <w:rPr>
+          <w:rFonts w:ascii="Times New Roman" w:eastAsia="Times New Roman" w:hAnsi="Times New Roman" w:cs="Times New Roman"/>
+          <w:b/>
+          <w:bCs/>
+          <w:kern w:val="0"/>
+          <w:sz w:val="27"/>
+          <w:szCs w:val="27"/>
+          <w:lang w:eastAsia="en-IN"/>
+          <w14:ligatures w14:val="none"/>
+        </w:rPr>
+        <w:t>What the Flow Does</w:t>
+      </w:r>
+    </w:p>
+    <w:p>
+      <w:pPr>
+        <w:spacing w:before="100" w:beforeAutospacing="1" w:after="100" w:afterAutospacing="1" w:line="240" w:lineRule="auto"/>
+        <w:rPr>
+          <w:rFonts w:ascii="Times New Roman" w:eastAsia="Times New Roman" w:hAnsi="Times New Roman" w:cs="Times New Roman"/>
+          <w:kern w:val="0"/>
+          <w:lang w:eastAsia="en-IN"/>
+          <w14:ligatures w14:val="none"/>
+        </w:rPr>
+      </w:pPr>
+      <w:r>
+        <w:rPr>
+          <w:rFonts w:ascii="Times New Roman" w:eastAsia="Times New Roman" w:hAnsi="Times New Roman" w:cs="Times New Roman"/>
+          <w:kern w:val="0"/>
+          <w:lang w:eastAsia="en-IN"/>
+          <w14:ligatures w14:val="none"/>
+        </w:rPr>
+        <w:t xml:space="preserve">The pipeline reads a PDF file, sends its content to an LLM (via </w:t>
+      </w:r>
+      <w:proofErr w:type="spellStart"/>
+      <w:r>
+        <w:rPr>
+          <w:rFonts w:ascii="Times New Roman" w:eastAsia="Times New Roman" w:hAnsi="Times New Roman" w:cs="Times New Roman"/>
+          <w:kern w:val="0"/>
+          <w:lang w:eastAsia="en-IN"/>
+          <w14:ligatures w14:val="none"/>
+        </w:rPr>
+        <w:t>Groq</w:t>
+      </w:r>
+      <w:proofErr w:type="spellEnd"/>
+      <w:r>
+        <w:rPr>
+          <w:rFonts w:ascii="Times New Roman" w:eastAsia="Times New Roman" w:hAnsi="Times New Roman" w:cs="Times New Roman"/>
+          <w:kern w:val="0"/>
+          <w:lang w:eastAsia="en-IN"/>
+          <w14:ligatures w14:val="none"/>
+        </w:rPr>
+        <w:t>), and outputs the result. Here's how each component works:</w:t>
+      </w:r>
+    </w:p>
+    <w:p>
+      <w:pPr>
+        <w:spacing w:before="100" w:beforeAutospacing="1" w:after="100" w:afterAutospacing="1" w:line="240" w:lineRule="auto"/>
+        <w:rPr>
+          <w:rFonts w:ascii="Times New Roman" w:eastAsia="Times New Roman" w:hAnsi="Times New Roman" w:cs="Times New Roman"/>
+          <w:kern w:val="0"/>
+          <w:lang w:eastAsia="en-IN"/>
+          <w14:ligatures w14:val="none"/>
+        </w:rPr>
+      </w:pPr>
+      <w:r>
+        <w:rPr>
+          <w:rFonts w:ascii="Times New Roman" w:eastAsia="Times New Roman" w:hAnsi="Times New Roman" w:cs="Times New Roman"/>
+          <w:b/>
+          <w:bCs/>
+          <w:kern w:val="0"/>
+          <w:lang w:eastAsia="en-IN"/>
+          <w14:ligatures w14:val="none"/>
+        </w:rPr>
+        <w:t>Image 1 — The Flow Canvas:</w:t>
+      </w:r>
+    </w:p>
+    <w:p>
+      <w:pPr>
+        <w:spacing w:before="100" w:beforeAutospacing="1" w:after="100" w:afterAutospacing="1" w:line="240" w:lineRule="auto"/>
+        <w:rPr>
+          <w:rFonts w:ascii="Times New Roman" w:eastAsia="Times New Roman" w:hAnsi="Times New Roman" w:cs="Times New Roman"/>
+          <w:kern w:val="0"/>
+          <w:lang w:eastAsia="en-IN"/>
+          <w14:ligatures w14:val="none"/>
+        </w:rPr>
+      </w:pPr>
+      <w:r>
+        <w:rPr>
+          <w:rFonts w:ascii="Times New Roman" w:eastAsia="Times New Roman" w:hAnsi="Times New Roman" w:cs="Times New Roman"/>
+          <w:kern w:val="0"/>
+          <w:lang w:eastAsia="en-IN"/>
+          <w14:ligatures w14:val="none"/>
+        </w:rPr>
+        <w:t>The flow has three connected nodes:</w:t>
+      </w:r>
+    </w:p>
+    <w:p>
+      <w:pPr>
+        <w:numPr>
+          <w:ilvl w:val="0"/>
+          <w:numId w:val="1"/>
+        </w:numPr>
+        <w:spacing w:before="100" w:beforeAutospacing="1" w:after="100" w:afterAutospacing="1" w:line="240" w:lineRule="auto"/>
+        <w:rPr>
+          <w:rFonts w:ascii="Times New Roman" w:eastAsia="Times New Roman" w:hAnsi="Times New Roman" w:cs="Times New Roman"/>
+          <w:kern w:val="0"/>
+          <w:lang w:eastAsia="en-IN"/>
+          <w14:ligatures w14:val="none"/>
+        </w:rPr>
+      </w:pPr>
+      <w:r>
+        <w:rPr>
+          <w:rFonts w:ascii="Times New Roman" w:eastAsia="Times New Roman" w:hAnsi="Times New Roman" w:cs="Times New Roman"/>
+          <w:b/>
+          <w:bCs/>
+          <w:kern w:val="0"/>
+          <w:lang w:eastAsia="en-IN"/>
+          <w14:ligatures w14:val="none"/>
+        </w:rPr>
+        <w:t>Read File</w:t>
+      </w:r>
+      <w:r>
+        <w:rPr>
+          <w:rFonts w:ascii="Times New Roman" w:eastAsia="Times New Roman" w:hAnsi="Times New Roman" w:cs="Times New Roman"/>
+          <w:kern w:val="0"/>
+          <w:lang w:eastAsia="en-IN"/>
+          <w14:ligatures w14:val="none"/>
+        </w:rPr>
+        <w:t xml:space="preserve"> — Loads a PDF (</w:t>
+      </w:r>
+      <w:proofErr w:type="spellStart"/>
+      <w:r>
+        <w:rPr>
+          <w:rFonts w:ascii="Courier New" w:eastAsia="Times New Roman" w:hAnsi="Courier New" w:cs="Courier New"/>
+          <w:kern w:val="0"/>
+          <w:sz w:val="20"/>
+          <w:szCs w:val="20"/>
+          <w:lang w:eastAsia="en-IN"/>
+          <w14:ligatures w14:val="none"/>
+        </w:rPr>
+        <w:t>sample_invoice</w:t>
+      </w:r>
+      <w:proofErr w:type="spellEnd"/>
+      <w:r>
+        <w:rPr>
+          <w:rFonts w:ascii="Courier New" w:eastAsia="Times New Roman" w:hAnsi="Courier New" w:cs="Courier New"/>
+          <w:kern w:val="0"/>
+          <w:sz w:val="20"/>
+          <w:szCs w:val="20"/>
+          <w:lang w:eastAsia="en-IN"/>
+          <w14:ligatures w14:val="none"/>
+        </w:rPr>
+        <w:t xml:space="preserve"> (1).pdf</w:t>
+      </w:r>
+      <w:r>
+        <w:rPr>
+          <w:rFonts w:ascii="Times New Roman" w:eastAsia="Times New Roman" w:hAnsi="Times New Roman" w:cs="Times New Roman"/>
+          <w:kern w:val="0"/>
+          <w:lang w:eastAsia="en-IN"/>
+          <w14:ligatures w14:val="none"/>
+        </w:rPr>
+        <w:t>, 3.65 KB) and extracts its raw text content. The "Advanced Parser" option is toggled off, meaning it uses basic text extraction.</w:t>
+      </w:r>
+    </w:p>
+    <w:p>
+      <w:pPr>
+        <w:numPr>
+          <w:ilvl w:val="0"/>
+          <w:numId w:val="1"/>
+        </w:numPr>
+        <w:spacing w:before="100" w:beforeAutospacing="1" w:after="100" w:afterAutospacing="1" w:line="240" w:lineRule="auto"/>
+        <w:rPr>
+          <w:rFonts w:ascii="Times New Roman" w:eastAsia="Times New Roman" w:hAnsi="Times New Roman" w:cs="Times New Roman"/>
+          <w:kern w:val="0"/>
+          <w:lang w:eastAsia="en-IN"/>
+          <w14:ligatures w14:val="none"/>
+        </w:rPr>
+      </w:pPr>
+      <w:r>
+        <w:rPr>
+          <w:rFonts w:ascii="Times New Roman" w:eastAsia="Times New Roman" w:hAnsi="Times New Roman" w:cs="Times New Roman"/>
+          <w:b/>
+          <w:bCs/>
+          <w:kern w:val="0"/>
+          <w:lang w:eastAsia="en-IN"/>
+          <w14:ligatures w14:val="none"/>
+        </w:rPr>
+        <w:t>Prompt Template</w:t>
+      </w:r>
+      <w:r>
+        <w:rPr>
+          <w:rFonts w:ascii="Times New Roman" w:eastAsia="Times New Roman" w:hAnsi="Times New Roman" w:cs="Times New Roman"/>
+          <w:kern w:val="0"/>
+          <w:lang w:eastAsia="en-IN"/>
+          <w14:ligatures w14:val="none"/>
+        </w:rPr>
+        <w:t xml:space="preserve"> — Takes the raw file content and injects it into a prompt. The visible text suggests a prompt like </w:t>
+      </w:r>
+      <w:r>
+        <w:rPr>
+          <w:rFonts w:ascii="Times New Roman" w:eastAsia="Times New Roman" w:hAnsi="Times New Roman" w:cs="Times New Roman"/>
+          <w:i/>
+          <w:iCs/>
+          <w:kern w:val="0"/>
+          <w:lang w:eastAsia="en-IN"/>
+          <w14:ligatures w14:val="none"/>
+        </w:rPr>
+        <w:t>"Read the entire PDF get strictly Copywriting – Homepage and..."</w:t>
+      </w:r>
+      <w:r>
+        <w:rPr>
+          <w:rFonts w:ascii="Times New Roman" w:eastAsia="Times New Roman" w:hAnsi="Times New Roman" w:cs="Times New Roman"/>
+          <w:kern w:val="0"/>
+          <w:lang w:eastAsia="en-IN"/>
+          <w14:ligatures w14:val="none"/>
+        </w:rPr>
+        <w:t xml:space="preserve"> — likely asking the LLM to extract or summarize specific information from the invoice.</w:t>
+      </w:r>
+    </w:p>
+    <w:p>
+      <w:pPr>
+        <w:numPr>
+          <w:ilvl w:val="0"/>
+          <w:numId w:val="1"/>
+        </w:numPr>
+        <w:spacing w:before="100" w:beforeAutospacing="1" w:after="100" w:afterAutospacing="1" w:line="240" w:lineRule="auto"/>
+        <w:rPr>
+          <w:rFonts w:ascii="Times New Roman" w:eastAsia="Times New Roman" w:hAnsi="Times New Roman" w:cs="Times New Roman"/>
+          <w:kern w:val="0"/>
+          <w:lang w:eastAsia="en-IN"/>
+          <w14:ligatures w14:val="none"/>
+        </w:rPr>
+      </w:pPr>
+      <w:proofErr w:type="spellStart"/>
+      <w:r>
+        <w:rPr>
+          <w:rFonts w:ascii="Times New Roman" w:eastAsia="Times New Roman" w:hAnsi="Times New Roman" w:cs="Times New Roman"/>
+          <w:b/>
+          <w:bCs/>
+          <w:kern w:val="0"/>
+          <w:lang w:eastAsia="en-IN"/>
+          <w14:ligatures w14:val="none"/>
+        </w:rPr>
+        <w:t>Groq</w:t>
+      </w:r>
+      <w:proofErr w:type="spellEnd"/>
+      <w:r>
+        <w:rPr>
+          <w:rFonts w:ascii="Times New Roman" w:eastAsia="Times New Roman" w:hAnsi="Times New Roman" w:cs="Times New Roman"/>
+          <w:b/>
+          <w:bCs/>
+          <w:kern w:val="0"/>
+          <w:lang w:eastAsia="en-IN"/>
+          <w14:ligatures w14:val="none"/>
+        </w:rPr>
+        <w:t xml:space="preserve"> (LLM)</w:t>
+      </w:r>
+      <w:r>
+        <w:rPr>
+          <w:rFonts w:ascii="Times New Roman" w:eastAsia="Times New Roman" w:hAnsi="Times New Roman" w:cs="Times New Roman"/>
+          <w:kern w:val="0"/>
+          <w:lang w:eastAsia="en-IN"/>
+          <w14:ligatures w14:val="none"/>
+        </w:rPr>
+        <w:t xml:space="preserve"> — Sends the assembled prompt to the </w:t>
+      </w:r>
+      <w:r>
+        <w:rPr>
+          <w:rFonts w:ascii="Times New Roman" w:eastAsia="Times New Roman" w:hAnsi="Times New Roman" w:cs="Times New Roman"/>
+          <w:b/>
+          <w:bCs/>
+          <w:kern w:val="0"/>
+          <w:lang w:eastAsia="en-IN"/>
+          <w14:ligatures w14:val="none"/>
+        </w:rPr>
+        <w:t>Llama-3.3-70b-versatile</w:t>
+      </w:r>
+      <w:r>
+        <w:rPr>
+          <w:rFonts w:ascii="Times New Roman" w:eastAsia="Times New Roman" w:hAnsi="Times New Roman" w:cs="Times New Roman"/>
+          <w:kern w:val="0"/>
+          <w:lang w:eastAsia="en-IN"/>
+          <w14:ligatures w14:val="none"/>
+        </w:rPr>
+        <w:t xml:space="preserve"> model via </w:t>
+      </w:r>
+      <w:proofErr w:type="spellStart"/>
+      <w:r>
+        <w:rPr>
+          <w:rFonts w:ascii="Times New Roman" w:eastAsia="Times New Roman" w:hAnsi="Times New Roman" w:cs="Times New Roman"/>
+          <w:kern w:val="0"/>
+          <w:lang w:eastAsia="en-IN"/>
+          <w14:ligatures w14:val="none"/>
+        </w:rPr>
+        <w:t>Groq's</w:t>
+      </w:r>
+      <w:proofErr w:type="spellEnd"/>
+      <w:r>
+        <w:rPr>
+          <w:rFonts w:ascii="Times New Roman" w:eastAsia="Times New Roman" w:hAnsi="Times New Roman" w:cs="Times New Roman"/>
+          <w:kern w:val="0"/>
+          <w:lang w:eastAsia="en-IN"/>
+          <w14:ligatures w14:val="none"/>
+        </w:rPr>
+        <w:t xml:space="preserve"> API. Key settings visible on the right panel: </w:t>
+      </w:r>
+    </w:p>
+    <w:p>
+      <w:pPr>
+        <w:numPr>
+          <w:ilvl w:val="1"/>
+          <w:numId w:val="1"/>
+        </w:numPr>
+        <w:spacing w:before="100" w:beforeAutospacing="1" w:after="100" w:afterAutospacing="1" w:line="240" w:lineRule="auto"/>
+        <w:rPr>
+          <w:rFonts w:ascii="Times New Roman" w:eastAsia="Times New Roman" w:hAnsi="Times New Roman" w:cs="Times New Roman"/>
+          <w:kern w:val="0"/>
+          <w:lang w:eastAsia="en-IN"/>
+          <w14:ligatures w14:val="none"/>
+        </w:rPr>
+      </w:pPr>
+      <w:r>
+        <w:rPr>
+          <w:rFonts w:ascii="Times New Roman" w:eastAsia="Times New Roman" w:hAnsi="Times New Roman" w:cs="Times New Roman"/>
+          <w:kern w:val="0"/>
+          <w:lang w:eastAsia="en-IN"/>
+          <w14:ligatures w14:val="none"/>
+        </w:rPr>
+        <w:t>Temperature: ~0.19 (low = more factual/deterministic output)</w:t>
+      </w:r>
+    </w:p>
+    <w:p>
+      <w:pPr>
+        <w:numPr>
+          <w:ilvl w:val="1"/>
+          <w:numId w:val="1"/>
+        </w:numPr>
+        <w:spacing w:before="100" w:beforeAutospacing="1" w:after="100" w:afterAutospacing="1" w:line="240" w:lineRule="auto"/>
+        <w:rPr>
+          <w:rFonts w:ascii="Times New Roman" w:eastAsia="Times New Roman" w:hAnsi="Times New Roman" w:cs="Times New Roman"/>
+          <w:kern w:val="0"/>
+          <w:lang w:eastAsia="en-IN"/>
+          <w14:ligatures w14:val="none"/>
+        </w:rPr>
+      </w:pPr>
+      <w:proofErr w:type="spellStart"/>
+      <w:r>
+        <w:rPr>
+          <w:rFonts w:ascii="Times New Roman" w:eastAsia="Times New Roman" w:hAnsi="Times New Roman" w:cs="Times New Roman"/>
+          <w:kern w:val="0"/>
+          <w:lang w:eastAsia="en-IN"/>
+          <w14:ligatures w14:val="none"/>
+        </w:rPr>
+        <w:t>Groq</w:t>
+      </w:r>
+      <w:proofErr w:type="spellEnd"/>
+      <w:r>
+        <w:rPr>
+          <w:rFonts w:ascii="Times New Roman" w:eastAsia="Times New Roman" w:hAnsi="Times New Roman" w:cs="Times New Roman"/>
+          <w:kern w:val="0"/>
+          <w:lang w:eastAsia="en-IN"/>
+          <w14:ligatures w14:val="none"/>
+        </w:rPr>
+        <w:t xml:space="preserve"> API Key is connected</w:t>
+      </w:r>
+    </w:p>
+    <w:p>
+      <w:pPr>
+        <w:numPr>
+          <w:ilvl w:val="1"/>
+          <w:numId w:val="1"/>
+        </w:numPr>
+        <w:spacing w:before="100" w:beforeAutospacing="1" w:after="100" w:afterAutospacing="1" w:line="240" w:lineRule="auto"/>
+        <w:rPr>
+          <w:rFonts w:ascii="Times New Roman" w:eastAsia="Times New Roman" w:hAnsi="Times New Roman" w:cs="Times New Roman"/>
+          <w:kern w:val="0"/>
+          <w:lang w:eastAsia="en-IN"/>
+          <w14:ligatures w14:val="none"/>
+        </w:rPr>
+      </w:pPr>
+      <w:r>
+        <w:rPr>
+          <w:rFonts w:ascii="Times New Roman" w:eastAsia="Times New Roman" w:hAnsi="Times New Roman" w:cs="Times New Roman"/>
+          <w:kern w:val="0"/>
+          <w:lang w:eastAsia="en-IN"/>
+          <w14:ligatures w14:val="none"/>
+        </w:rPr>
+        <w:t xml:space="preserve">Output feeds into a </w:t>
+      </w:r>
+      <w:r>
+        <w:rPr>
+          <w:rFonts w:ascii="Times New Roman" w:eastAsia="Times New Roman" w:hAnsi="Times New Roman" w:cs="Times New Roman"/>
+          <w:b/>
+          <w:bCs/>
+          <w:kern w:val="0"/>
+          <w:lang w:eastAsia="en-IN"/>
+          <w14:ligatures w14:val="none"/>
+        </w:rPr>
+        <w:t>Chat Output</w:t>
+      </w:r>
+      <w:r>
+        <w:rPr>
+          <w:rFonts w:ascii="Times New Roman" w:eastAsia="Times New Roman" w:hAnsi="Times New Roman" w:cs="Times New Roman"/>
+          <w:kern w:val="0"/>
+          <w:lang w:eastAsia="en-IN"/>
+          <w14:ligatures w14:val="none"/>
+        </w:rPr>
+        <w:t xml:space="preserve"> node</w:t>
+      </w:r>
+    </w:p>
+    <w:p>
+      <w:pPr>
+        <w:spacing w:before="100" w:beforeAutospacing="1" w:after="100" w:afterAutospacing="1" w:line="240" w:lineRule="auto"/>
+        <w:rPr>
+          <w:rFonts w:ascii="Times New Roman" w:eastAsia="Times New Roman" w:hAnsi="Times New Roman" w:cs="Times New Roman"/>
+          <w:kern w:val="0"/>
+          <w:lang w:eastAsia="en-IN"/>
+          <w14:ligatures w14:val="none"/>
+        </w:rPr>
+      </w:pPr>
+      <w:r>
+        <w:rPr>
+          <w:rFonts w:ascii="Times New Roman" w:eastAsia="Times New Roman" w:hAnsi="Times New Roman" w:cs="Times New Roman"/>
+          <w:b/>
+          <w:bCs/>
+          <w:kern w:val="0"/>
+          <w:lang w:eastAsia="en-IN"/>
+          <w14:ligatures w14:val="none"/>
+        </w:rPr>
+        <w:t>Image 2 — The Result:</w:t>
+      </w:r>
+    </w:p>
+    <w:p>
+      <w:pPr>
+        <w:spacing w:before="100" w:beforeAutospacing="1" w:after="100" w:afterAutospacing="1" w:line="240" w:lineRule="auto"/>
+        <w:rPr>
+          <w:rFonts w:ascii="Times New Roman" w:eastAsia="Times New Roman" w:hAnsi="Times New Roman" w:cs="Times New Roman"/>
+          <w:kern w:val="0"/>
+          <w:lang w:eastAsia="en-IN"/>
+          <w14:ligatures w14:val="none"/>
+        </w:rPr>
+      </w:pPr>
+      <w:r>
+        <w:rPr>
+          <w:rFonts w:ascii="Times New Roman" w:eastAsia="Times New Roman" w:hAnsi="Times New Roman" w:cs="Times New Roman"/>
+          <w:kern w:val="0"/>
+          <w:lang w:eastAsia="en-IN"/>
+          <w14:ligatures w14:val="none"/>
+        </w:rPr>
+        <w:t xml:space="preserve">After running the flow, the </w:t>
+      </w:r>
+      <w:r>
+        <w:rPr>
+          <w:rFonts w:ascii="Times New Roman" w:eastAsia="Times New Roman" w:hAnsi="Times New Roman" w:cs="Times New Roman"/>
+          <w:b/>
+          <w:bCs/>
+          <w:kern w:val="0"/>
+          <w:lang w:eastAsia="en-IN"/>
+          <w14:ligatures w14:val="none"/>
+        </w:rPr>
+        <w:t>Component Output</w:t>
+      </w:r>
+      <w:r>
+        <w:rPr>
+          <w:rFonts w:ascii="Times New Roman" w:eastAsia="Times New Roman" w:hAnsi="Times New Roman" w:cs="Times New Roman"/>
+          <w:kern w:val="0"/>
+          <w:lang w:eastAsia="en-IN"/>
+          <w14:ligatures w14:val="none"/>
+        </w:rPr>
+        <w:t xml:space="preserve"> panel shows the result: </w:t>
+      </w:r>
+      <w:r>
+        <w:rPr>
+          <w:rFonts w:ascii="Courier New" w:eastAsia="Times New Roman" w:hAnsi="Courier New" w:cs="Courier New"/>
+          <w:b/>
+          <w:bCs/>
+          <w:kern w:val="0"/>
+          <w:sz w:val="20"/>
+          <w:szCs w:val="20"/>
+          <w:lang w:eastAsia="en-IN"/>
+          <w14:ligatures w14:val="none"/>
+        </w:rPr>
+        <w:t>$600.00</w:t>
+      </w:r>
+      <w:r>
+        <w:rPr>
+          <w:rFonts w:ascii="Times New Roman" w:eastAsia="Times New Roman" w:hAnsi="Times New Roman" w:cs="Times New Roman"/>
+          <w:kern w:val="0"/>
+          <w:lang w:eastAsia="en-IN"/>
+          <w14:ligatures w14:val="none"/>
+        </w:rPr>
+        <w:t xml:space="preserve"> — meaning the AI successfully read the invoice PDF and extracted the total amount ($600) from it.</w:t>
+      </w:r>
+    </w:p>
     <w:p/>
     <w:p/>
-    <w:p>
-      <w:pPr>
-        <w:pStyle w:val="Heading1"/>
-      </w:pPr>
-      <w:r>
-        <w:t>Phase 2 – Week 1, Day 1: Building an AI Flow in Langflow</w:t>
-      </w:r>
-    </w:p>
-    <w:p>
-      <w:r>
-        <w:t>This assignment demonstrates building a simple AI-powered document processing pipeline using Langflow (a visual, no-code/low-code tool for chaining AI components).</w:t>
-      </w:r>
-    </w:p>
-    <w:p>
-      <w:pPr>
-        <w:pStyle w:val="Heading2"/>
-      </w:pPr>
-      <w:r>
-        <w:t>What the Flow Does</w:t>
-      </w:r>
-    </w:p>
-    <w:p>
-      <w:r>
-        <w:t>The pipeline reads a PDF file, sends its content to an LLM (via Groq), and outputs the result. Here's how each component works:</w:t>
-      </w:r>
-    </w:p>
-    <w:p>
-      <w:pPr>
-        <w:pStyle w:val="Heading3"/>
-      </w:pPr>
-      <w:r>
-        <w:t>Image 1 — The Flow Canvas:</w:t>
-      </w:r>
-    </w:p>
-    <w:p>
-      <w:r>
-        <w:t>The flow has three connected nodes:</w:t>
-      </w:r>
-    </w:p>
-    <w:p>
-      <w:r>
-        <w:t xml:space="preserve">1. </w:t>
-      </w:r>
-      <w:r>
-        <w:rPr>
-          <w:b/>
-        </w:rPr>
-        <w:t>Read File</w:t>
-      </w:r>
-      <w:r>
-        <w:t xml:space="preserve"> — Loads a PDF (sample_invoice (1).pdf, 3.65 KB) and extracts its raw text content. The "Advanced Parser" option is toggled off, meaning it uses basic text extraction.</w:t>
-      </w:r>
-    </w:p>
-    <w:p>
-      <w:r>
-        <w:t xml:space="preserve">2. </w:t>
-      </w:r>
-      <w:r>
-        <w:rPr>
-          <w:b/>
-        </w:rPr>
-        <w:t>Prompt Template</w:t>
-      </w:r>
-      <w:r>
-        <w:t xml:space="preserve"> — Takes the raw file content and injects it into a prompt. The visible text suggests a prompt like "Read the entire PDF get strictly Copywriting – Homepage and..." — likely asking the LLM to extract or summarize specific information from the invoice.</w:t>
-      </w:r>
-    </w:p>
-    <w:p>
-      <w:r>
-        <w:t xml:space="preserve">3. </w:t>
-      </w:r>
-      <w:r>
-        <w:rPr>
-          <w:b/>
-        </w:rPr>
-        <w:t>Groq (LLM)</w:t>
-      </w:r>
-      <w:r>
-        <w:t xml:space="preserve"> — Sends the assembled prompt to the Llama-3.3-70b-versatile model via Groq's API. Key settings visible on the right panel:</w:t>
-      </w:r>
-    </w:p>
-    <w:p>
-      <w:r>
-        <w:t xml:space="preserve">    • Temperature: ~0.19 (low = more factual/deterministic output)</w:t>
-      </w:r>
-    </w:p>
-    <w:p>
-      <w:r>
-        <w:t xml:space="preserve">    • Groq API Key is connected</w:t>
-      </w:r>
-    </w:p>
-    <w:p>
-      <w:r>
-        <w:t xml:space="preserve">    • Output feeds into a Chat Output node</w:t>
-      </w:r>
-    </w:p>
-    <w:p>
-      <w:pPr>
-        <w:pStyle w:val="Heading3"/>
-      </w:pPr>
-      <w:r>
-        <w:t>Image 2 — The Result:</w:t>
-      </w:r>
-    </w:p>
-    <w:p>
-      <w:r>
-        <w:t>After running the flow, the Component Output panel shows the result: $600.00 — meaning the AI successfully read the invoice PDF and extracted the total amount ($600) from it.</w:t>
-      </w:r>
-    </w:p>
+    <w:p/>
     <w:sectPr>
       <w:pgSz w:w="11906" w:h="16838"/>
       <w:pgMar w:top="1440" w:right="1440" w:bottom="1440" w:left="1440" w:header="708" w:footer="708" w:gutter="0"/>
@@ -207,6 +715,131 @@
     </w:sectPr>
   </w:body>
 </w:document>
+</file>
+
+<file path=word/numbering.xml><?xml version="1.0" encoding="utf-8"?>
+<w:numbering xmlns:wpc="http://schemas.microsoft.com/office/word/2010/wordprocessingCanvas" xmlns:cx="http://schemas.microsoft.com/office/drawing/2014/chartex" xmlns:cx1="http://schemas.microsoft.com/office/drawing/2015/9/8/chartex" xmlns:cx2="http://schemas.microsoft.com/office/drawing/2015/10/21/chartex" xmlns:cx3="http://schemas.microsoft.com/office/drawing/2016/5/9/chartex" xmlns:cx4="http://schemas.microsoft.com/office/drawing/2016/5/10/chartex" xmlns:cx5="http://schemas.microsoft.com/office/drawing/2016/5/11/chartex" xmlns:cx6="http://schemas.microsoft.com/office/drawing/2016/5/12/chartex" xmlns:cx7="http://schemas.microsoft.com/office/drawing/2016/5/13/chartex" xmlns:cx8="http://schemas.microsoft.com/office/drawing/2016/5/14/chartex" xmlns:mc="http://schemas.openxmlformats.org/markup-compatibility/2006" xmlns:aink="http://schemas.microsoft.com/office/drawing/2016/ink" xmlns:am3d="http://schemas.microsoft.com/office/drawing/2017/model3d" xmlns:o="urn:schemas-microsoft-com:office:office" xmlns:oel="http://schemas.microsoft.com/office/2019/extlst" xmlns:r="http://schemas.openxmlformats.org/officeDocument/2006/relationships" xmlns:m="http://schemas.openxmlformats.org/officeDocument/2006/math" xmlns:v="urn:schemas-microsoft-com:vml" xmlns:wp14="http://schemas.microsoft.com/office/word/2010/wordprocessingDrawing" xmlns:wp="http://schemas.openxmlformats.org/drawingml/2006/wordprocessingDrawing" xmlns:w10="urn:schemas-microsoft-com:office:word" xmlns:w="http://schemas.openxmlformats.org/wordprocessingml/2006/main" xmlns:w14="http://schemas.microsoft.com/office/word/2010/wordml" xmlns:w15="http://schemas.microsoft.com/office/word/2012/wordml" xmlns:w16cex="http://schemas.microsoft.com/office/word/2018/wordml/cex" xmlns:w16cid="http://schemas.microsoft.com/office/word/2016/wordml/cid" xmlns:w16="http://schemas.microsoft.com/office/word/2018/wordml" xmlns:w16du="http://schemas.microsoft.com/office/word/2023/wordml/word16du" xmlns:w16sdtdh="http://schemas.microsoft.com/office/word/2020/wordml/sdtdatahash" xmlns:w16sdtfl="http://schemas.microsoft.com/office/word/2024/wordml/sdtformatlock" xmlns:w16se="http://schemas.microsoft.com/office/word/2015/wordml/symex" xmlns:wpg="http://schemas.microsoft.com/office/word/2010/wordprocessingGroup" xmlns:wpi="http://schemas.microsoft.com/office/word/2010/wordprocessingInk" xmlns:wne="http://schemas.microsoft.com/office/word/2006/wordml" xmlns:wps="http://schemas.microsoft.com/office/word/2010/wordprocessingShape" mc:Ignorable="w14 w15 w16se w16cid w16 w16cex w16sdtdh w16sdtfl w16du wp14">
+  <w:abstractNum w:abstractNumId="0" w15:restartNumberingAfterBreak="0">
+    <w:nsid w:val="1DCA0E77"/>
+    <w:multiLevelType w:val="multilevel"/>
+    <w:tmpl w:val="D4880012"/>
+    <w:lvl w:ilvl="0">
+      <w:start w:val="1"/>
+      <w:numFmt w:val="decimal"/>
+      <w:lvlText w:val="%1."/>
+      <w:lvlJc w:val="left"/>
+      <w:pPr>
+        <w:tabs>
+          <w:tab w:val="num" w:pos="720"/>
+        </w:tabs>
+        <w:ind w:left="720" w:hanging="360"/>
+      </w:pPr>
+    </w:lvl>
+    <w:lvl w:ilvl="1">
+      <w:start w:val="1"/>
+      <w:numFmt w:val="bullet"/>
+      <w:lvlText w:val="o"/>
+      <w:lvlJc w:val="left"/>
+      <w:pPr>
+        <w:tabs>
+          <w:tab w:val="num" w:pos="1440"/>
+        </w:tabs>
+        <w:ind w:left="1440" w:hanging="360"/>
+      </w:pPr>
+      <w:rPr>
+        <w:rFonts w:ascii="Courier New" w:hAnsi="Courier New" w:hint="default"/>
+        <w:sz w:val="20"/>
+      </w:rPr>
+    </w:lvl>
+    <w:lvl w:ilvl="2" w:tentative="1">
+      <w:start w:val="1"/>
+      <w:numFmt w:val="decimal"/>
+      <w:lvlText w:val="%3."/>
+      <w:lvlJc w:val="left"/>
+      <w:pPr>
+        <w:tabs>
+          <w:tab w:val="num" w:pos="2160"/>
+        </w:tabs>
+        <w:ind w:left="2160" w:hanging="360"/>
+      </w:pPr>
+    </w:lvl>
+    <w:lvl w:ilvl="3" w:tentative="1">
+      <w:start w:val="1"/>
+      <w:numFmt w:val="decimal"/>
+      <w:lvlText w:val="%4."/>
+      <w:lvlJc w:val="left"/>
+      <w:pPr>
+        <w:tabs>
+          <w:tab w:val="num" w:pos="2880"/>
+        </w:tabs>
+        <w:ind w:left="2880" w:hanging="360"/>
+      </w:pPr>
+    </w:lvl>
+    <w:lvl w:ilvl="4" w:tentative="1">
+      <w:start w:val="1"/>
+      <w:numFmt w:val="decimal"/>
+      <w:lvlText w:val="%5."/>
+      <w:lvlJc w:val="left"/>
+      <w:pPr>
+        <w:tabs>
+          <w:tab w:val="num" w:pos="3600"/>
+        </w:tabs>
+        <w:ind w:left="3600" w:hanging="360"/>
+      </w:pPr>
+    </w:lvl>
+    <w:lvl w:ilvl="5" w:tentative="1">
+      <w:start w:val="1"/>
+      <w:numFmt w:val="decimal"/>
+      <w:lvlText w:val="%6."/>
+      <w:lvlJc w:val="left"/>
+      <w:pPr>
+        <w:tabs>
+          <w:tab w:val="num" w:pos="4320"/>
+        </w:tabs>
+        <w:ind w:left="4320" w:hanging="360"/>
+      </w:pPr>
+    </w:lvl>
+    <w:lvl w:ilvl="6" w:tentative="1">
+      <w:start w:val="1"/>
+      <w:numFmt w:val="decimal"/>
+      <w:lvlText w:val="%7."/>
+      <w:lvlJc w:val="left"/>
+      <w:pPr>
+        <w:tabs>
+          <w:tab w:val="num" w:pos="5040"/>
+        </w:tabs>
+        <w:ind w:left="5040" w:hanging="360"/>
+      </w:pPr>
+    </w:lvl>
+    <w:lvl w:ilvl="7" w:tentative="1">
+      <w:start w:val="1"/>
+      <w:numFmt w:val="decimal"/>
+      <w:lvlText w:val="%8."/>
+      <w:lvlJc w:val="left"/>
+      <w:pPr>
+        <w:tabs>
+          <w:tab w:val="num" w:pos="5760"/>
+        </w:tabs>
+        <w:ind w:left="5760" w:hanging="360"/>
+      </w:pPr>
+    </w:lvl>
+    <w:lvl w:ilvl="8" w:tentative="1">
+      <w:start w:val="1"/>
+      <w:numFmt w:val="decimal"/>
+      <w:lvlText w:val="%9."/>
+      <w:lvlJc w:val="left"/>
+      <w:pPr>
+        <w:tabs>
+          <w:tab w:val="num" w:pos="6480"/>
+        </w:tabs>
+        <w:ind w:left="6480" w:hanging="360"/>
+      </w:pPr>
+    </w:lvl>
+  </w:abstractNum>
+  <w:num w:numId="1" w16cid:durableId="2129083724">
+    <w:abstractNumId w:val="0"/>
+  </w:num>
+</w:numbering>
 </file>
 
 <file path=word/styles.xml><?xml version="1.0" encoding="utf-8"?>
@@ -637,7 +1270,6 @@
     <w:next w:val="Normal"/>
     <w:link w:val="Heading2Char"/>
     <w:uiPriority w:val="9"/>
-    <w:semiHidden/>
     <w:unhideWhenUsed/>
     <w:qFormat/>
     <w:rsid w:val="00D46DD3"/>
@@ -660,7 +1292,6 @@
     <w:next w:val="Normal"/>
     <w:link w:val="Heading3Char"/>
     <w:uiPriority w:val="9"/>
-    <w:semiHidden/>
     <w:unhideWhenUsed/>
     <w:qFormat/>
     <w:rsid w:val="00D46DD3"/>
@@ -854,7 +1485,6 @@
     <w:basedOn w:val="DefaultParagraphFont"/>
     <w:link w:val="Heading2"/>
     <w:uiPriority w:val="9"/>
-    <w:semiHidden/>
     <w:rsid w:val="00D46DD3"/>
     <w:rPr>
       <w:rFonts w:asciiTheme="majorHAnsi" w:eastAsiaTheme="majorEastAsia" w:hAnsiTheme="majorHAnsi" w:cstheme="majorBidi"/>
@@ -868,7 +1498,6 @@
     <w:basedOn w:val="DefaultParagraphFont"/>
     <w:link w:val="Heading3"/>
     <w:uiPriority w:val="9"/>
-    <w:semiHidden/>
     <w:rsid w:val="00D46DD3"/>
     <w:rPr>
       <w:rFonts w:eastAsiaTheme="majorEastAsia" w:cstheme="majorBidi"/>
@@ -1124,6 +1753,69 @@
       <w:smallCaps/>
       <w:color w:val="0F4761" w:themeColor="accent1" w:themeShade="BF"/>
       <w:spacing w:val="5"/>
+    </w:rPr>
+  </w:style>
+  <w:style w:type="paragraph" w:customStyle="1" w:styleId="font-claude-response-body">
+    <w:name w:val="font-claude-response-body"/>
+    <w:basedOn w:val="Normal"/>
+    <w:rsid w:val="00C500B1"/>
+    <w:pPr>
+      <w:spacing w:before="100" w:beforeAutospacing="1" w:after="100" w:afterAutospacing="1" w:line="240" w:lineRule="auto"/>
+    </w:pPr>
+    <w:rPr>
+      <w:rFonts w:ascii="Times New Roman" w:eastAsia="Times New Roman" w:hAnsi="Times New Roman" w:cs="Times New Roman"/>
+      <w:kern w:val="0"/>
+      <w:lang w:eastAsia="en-IN"/>
+      <w14:ligatures w14:val="none"/>
+    </w:rPr>
+  </w:style>
+  <w:style w:type="character" w:styleId="Strong">
+    <w:name w:val="Strong"/>
+    <w:basedOn w:val="DefaultParagraphFont"/>
+    <w:uiPriority w:val="22"/>
+    <w:qFormat/>
+    <w:rsid w:val="00C500B1"/>
+    <w:rPr>
+      <w:b/>
+      <w:bCs/>
+    </w:rPr>
+  </w:style>
+  <w:style w:type="paragraph" w:customStyle="1" w:styleId="whitespace-normal">
+    <w:name w:val="whitespace-normal"/>
+    <w:basedOn w:val="Normal"/>
+    <w:rsid w:val="00C500B1"/>
+    <w:pPr>
+      <w:spacing w:before="100" w:beforeAutospacing="1" w:after="100" w:afterAutospacing="1" w:line="240" w:lineRule="auto"/>
+    </w:pPr>
+    <w:rPr>
+      <w:rFonts w:ascii="Times New Roman" w:eastAsia="Times New Roman" w:hAnsi="Times New Roman" w:cs="Times New Roman"/>
+      <w:kern w:val="0"/>
+      <w:lang w:eastAsia="en-IN"/>
+      <w14:ligatures w14:val="none"/>
+    </w:rPr>
+  </w:style>
+  <w:style w:type="character" w:styleId="HTMLCode">
+    <w:name w:val="HTML Code"/>
+    <w:basedOn w:val="DefaultParagraphFont"/>
+    <w:uiPriority w:val="99"/>
+    <w:semiHidden/>
+    <w:unhideWhenUsed/>
+    <w:rsid w:val="00C500B1"/>
+    <w:rPr>
+      <w:rFonts w:ascii="Courier New" w:eastAsia="Times New Roman" w:hAnsi="Courier New" w:cs="Courier New"/>
+      <w:sz w:val="20"/>
+      <w:szCs w:val="20"/>
+    </w:rPr>
+  </w:style>
+  <w:style w:type="character" w:styleId="Emphasis">
+    <w:name w:val="Emphasis"/>
+    <w:basedOn w:val="DefaultParagraphFont"/>
+    <w:uiPriority w:val="20"/>
+    <w:qFormat/>
+    <w:rsid w:val="00C500B1"/>
+    <w:rPr>
+      <w:i/>
+      <w:iCs/>
     </w:rPr>
   </w:style>
 </w:styles>

</xml_diff>